<commit_message>
FU-RECORD v1.1 — hybrid acknowledgment ownership carry-forward
</commit_message>
<xml_diff>
--- a/PRDs/FU/FU-RECORD.docx
+++ b/PRDs/FU/FU-RECORD.docx
@@ -97,7 +97,7 @@
                 <w:b w:val="false"/>
                 <w:bCs w:val="false"/>
               </w:rPr>
-              <w:t xml:space="preserve">1.0</w:t>
+              <w:t xml:space="preserve">1.1</w:t>
             </w:r>
           </w:p>
         </w:tc>
@@ -207,7 +207,7 @@
                 <w:b w:val="false"/>
                 <w:bCs w:val="false"/>
               </w:rPr>
-              <w:t xml:space="preserve">04-29-26 04:16</w:t>
+              <w:t xml:space="preserve">04-29-26 23:00</w:t>
             </w:r>
           </w:p>
         </w:tc>
@@ -553,7 +553,7 @@
           <w:b w:val="false"/>
           <w:bCs w:val="false"/>
         </w:rPr>
-        <w:t xml:space="preserve">FU-RECORD also resolves the acknowledgment / tax-receipt model question that EI-ISS-001 carried forward from the Entity Inventory and the Fundraising Domain Overview. The resolution is field-level capability on Contribution rather than a separate Acknowledgment entity — two optional fields (acknowledgmentSent, acknowledgmentDate) shared across all contribution types, with specifics of any given acknowledgment recorded in notes. The model is leaner than the Domain Overview’s working position (which proposed three Donation-only fields including taxReceiptRequired) and reflects the recording-only operational scope of this process.</w:t>
+        <w:t xml:space="preserve">FU-RECORD also resolves the acknowledgment / tax-receipt model question that EI-ISS-001 carried forward from the Entity Inventory and the Fundraising Domain Overview. The resolution is field-level capability on Contribution rather than a separate Acknowledgment entity — two optional fields (acknowledgmentSent, acknowledgmentDate) shared across all contribution types, with specifics of any given acknowledgment recorded in notes. The model is leaner than the Domain Overview’s working position (which proposed three Donation-only fields including taxReceiptRequired). The two acknowledgment fields are jointly owned by FU-RECORD and FU-STEWARD under a hybrid ownership model. FU-RECORD is the primary write path: when a Contribution is recorded, the Coordinator typically sends the acknowledgment communication in the same operational moment and writes acknowledgmentSent and acknowledgmentDate at Contribution creation. FU-STEWARD is the catch-up write path: any Received Contribution where acknowledgmentSent = false is surfaced on the FU-STEWARD Acknowledgment-Pending Contributions sweep list, and the Coordinator sends the missed acknowledgment and writes the fields during the next sweep.</w:t>
       </w:r>
     </w:p>
     <w:p>
@@ -1029,7 +1029,7 @@
         </w:numPr>
       </w:pPr>
       <w:r>
-        <w:t xml:space="preserve">Acknowledgment generation. When the Coordinator sends an acknowledgment communication (a thank-you letter, a tax receipt, an email of thanks), the Coordinator sets acknowledgmentSent to true on the Contribution and records acknowledgmentDate. Specifics of what was sent in any given case are recorded in notes if the Coordinator wants. These two fields are shared across all contribution types and do not require a structured acknowledgmentMethod or taxReceiptRequired field; the Coordinator’s judgment governs what is sent and what is captured in notes.</w:t>
+        <w:t xml:space="preserve">Acknowledgment generation (primary write path). When the Coordinator sends an acknowledgment communication (a thank-you letter, a tax receipt, an email of thanks) at the moment of Contribution recording, the Coordinator sets acknowledgmentSent to true on the Contribution and records acknowledgmentDate. This is the typical and preferred path: the operational efficiency of acknowledging at the moment of recording is the reason FU-RECORD is the primary owner of these fields. Specifics of what was sent in any given case are recorded in notes if the Coordinator wants. These two fields are shared across all contribution types and do not require a structured acknowledgmentMethod or taxReceiptRequired field; the Coordinator’s judgment governs what is sent and what is captured in notes. If the Coordinator does not send the acknowledgment at FU-RECORD time, the missed acknowledgment is captured on the FU-STEWARD Acknowledgment-Pending Contributions sweep list and sent during the next FU-STEWARD sweep, with FU-STEWARD writing the same two fields.</w:t>
       </w:r>
     </w:p>
     <w:p>
@@ -2385,7 +2385,7 @@
                 <w:b w:val="false"/>
                 <w:bCs w:val="false"/>
               </w:rPr>
-              <w:t xml:space="preserve">The system must provide acknowledgmentSent (boolean) and acknowledgmentDate (date) fields on every Contribution record, regardless of contributionType. Both fields are optional and Coordinator-set. Specifics of what was sent in any given case are recorded in notes. This resolves EI-ISS-001 with field-level capability rather than a separate Acknowledgment entity.</w:t>
+              <w:t xml:space="preserve">The system must provide acknowledgmentSent (boolean) and acknowledgmentDate (date) fields on every Contribution record, regardless of contributionType. Both fields are optional and Coordinator-set. The fields are jointly owned by FU-RECORD and FU-STEWARD under a hybrid ownership model: FU-RECORD is the primary write path (acknowledgment sent and recorded at the moment of Contribution creation); FU-STEWARD is the catch-up write path (acknowledgment sent and recorded during the FU-STEWARD sweep when missed at FU-RECORD time). See FU-STEWARD-REQ-004. Specifics of what was sent in any given case are recorded in notes. This resolves EI-ISS-001 with field-level capability rather than a separate Acknowledgment entity.</w:t>
             </w:r>
           </w:p>
         </w:tc>
@@ -11949,7 +11949,7 @@
                 <w:b w:val="false"/>
                 <w:bCs w:val="false"/>
               </w:rPr>
-              <w:t xml:space="preserve">CLOSED by FU-RECORD. The resolution is field-level capability, but with a leaner and broader scope than the Domain Overview’s working position: two fields on Contribution — acknowledgmentSent (boolean) and acknowledgmentDate (date) per FU-RECORD-DAT-032 and DAT-033 — both optional, both Coordinator-set, both shared across all contribution types (Donation, Sponsorship, Grant) rather than Donation-only. Specified in full by FU-RECORD-REQ-015. No standalone Acknowledgment entity. No taxReceiptRequired field. No acknowledgmentMethod enum. Specifics of what was sent in any given case are recorded in notes. The deviation from the Domain Overview’s working position (which proposed three Donation-only fields including taxReceiptRequired) is intentional and reflects the recording-only operational model — generation, sending, and tax-receipt content are out of FU-RECORD scope and will be addressed by FU-STEWARD where relevant.</w:t>
+              <w:t xml:space="preserve">CLOSED by FU-RECORD. The resolution is field-level capability, but with a leaner and broader scope than the Domain Overview’s working position: two fields on Contribution — acknowledgmentSent (boolean) and acknowledgmentDate (date) per FU-RECORD-DAT-032 and DAT-033 — both optional, both Coordinator-set, both shared across all contribution types (Donation, Sponsorship, Grant) rather than Donation-only. Specified in full by FU-RECORD-REQ-015. No standalone Acknowledgment entity. No taxReceiptRequired field. No acknowledgmentMethod enum. Specifics of what was sent in any given case are recorded in notes. The deviation from the Domain Overview’s working position (which proposed three Donation-only fields including taxReceiptRequired) is intentional. Acknowledgment generation and sending follow a hybrid ownership model surfaced during the FU-STEWARD interview: FU-RECORD is the primary write path — when a Contribution is recorded, the Coordinator typically sends the acknowledgment in the same operational moment and writes the fields immediately; FU-STEWARD is the catch-up write path — any Received Contribution where acknowledgmentSent = false is surfaced on the FU-STEWARD Acknowledgment-Pending Contributions sweep list and the missed acknowledgment is sent during the next sweep. See FU-STEWARD-REQ-004 for the FU-STEWARD-side write authorization.</w:t>
             </w:r>
           </w:p>
         </w:tc>
@@ -14459,6 +14459,86 @@
                 <w:bCs/>
               </w:rPr>
               <w:t xml:space="preserve">Changes</w:t>
+            </w:r>
+          </w:p>
+        </w:tc>
+      </w:tr>
+      <w:tr>
+        <w:tc>
+          <w:tcPr>
+            <w:tcW w:type="dxa" w:w="1500"/>
+            <w:tcBorders>
+              <w:top w:val="single" w:color="999999" w:sz="4"/>
+              <w:left w:val="single" w:color="999999" w:sz="4"/>
+              <w:bottom w:val="single" w:color="999999" w:sz="4"/>
+              <w:right w:val="single" w:color="999999" w:sz="4"/>
+            </w:tcBorders>
+            <w:tcMar>
+              <w:top w:type="dxa" w:w="80"/>
+              <w:left w:type="dxa" w:w="120"/>
+              <w:bottom w:type="dxa" w:w="80"/>
+              <w:right w:type="dxa" w:w="120"/>
+            </w:tcMar>
+          </w:tcPr>
+          <w:p>
+            <w:r>
+              <w:rPr>
+                <w:b w:val="false"/>
+                <w:bCs w:val="false"/>
+              </w:rPr>
+              <w:t xml:space="preserve">1.1</w:t>
+            </w:r>
+          </w:p>
+        </w:tc>
+        <w:tc>
+          <w:tcPr>
+            <w:tcW w:type="dxa" w:w="1500"/>
+            <w:tcBorders>
+              <w:top w:val="single" w:color="999999" w:sz="4"/>
+              <w:left w:val="single" w:color="999999" w:sz="4"/>
+              <w:bottom w:val="single" w:color="999999" w:sz="4"/>
+              <w:right w:val="single" w:color="999999" w:sz="4"/>
+            </w:tcBorders>
+            <w:tcMar>
+              <w:top w:type="dxa" w:w="80"/>
+              <w:left w:type="dxa" w:w="120"/>
+              <w:bottom w:type="dxa" w:w="80"/>
+              <w:right w:type="dxa" w:w="120"/>
+            </w:tcMar>
+          </w:tcPr>
+          <w:p>
+            <w:r>
+              <w:rPr>
+                <w:b w:val="false"/>
+                <w:bCs w:val="false"/>
+              </w:rPr>
+              <w:t xml:space="preserve">04-29-26 23:00</w:t>
+            </w:r>
+          </w:p>
+        </w:tc>
+        <w:tc>
+          <w:tcPr>
+            <w:tcW w:type="dxa" w:w="6360"/>
+            <w:tcBorders>
+              <w:top w:val="single" w:color="999999" w:sz="4"/>
+              <w:left w:val="single" w:color="999999" w:sz="4"/>
+              <w:bottom w:val="single" w:color="999999" w:sz="4"/>
+              <w:right w:val="single" w:color="999999" w:sz="4"/>
+            </w:tcBorders>
+            <w:tcMar>
+              <w:top w:type="dxa" w:w="80"/>
+              <w:left w:type="dxa" w:w="120"/>
+              <w:bottom w:type="dxa" w:w="80"/>
+              <w:right w:type="dxa" w:w="120"/>
+            </w:tcMar>
+          </w:tcPr>
+          <w:p>
+            <w:r>
+              <w:rPr>
+                <w:b w:val="false"/>
+                <w:bCs w:val="false"/>
+              </w:rPr>
+              <w:t xml:space="preserve">Carry-forward update applying the hybrid acknowledgment ownership model surfaced during the FU-STEWARD process definition interview on 04-29-26. Source: FU-STEWARD.docx v1.0 Section 10.7 (Interview Transcript) and Section 9 (Open Issues, EI-ISS-001 disposition note). Four content edits applied: Section 1 last paragraph rewritten to introduce the hybrid acknowledgment ownership model under which the two acknowledgmentSent and acknowledgmentDate fields are jointly owned by FU-RECORD and FU-STEWARD; Section 4.1 step 6 (Acknowledgment generation) rewritten to identify it as the primary write path executed at the moment of Contribution recording and to reference the FU-STEWARD catch-up write path executed during the sweep for missed acknowledgments; Section 6 FU-RECORD-REQ-015 rewritten to describe the joint ownership and to reference FU-STEWARD-REQ-004 as the FU-STEWARD-side write authorization; Section 9 EI-ISS-001 disposition closing sentences rewritten to replace the original "out of scope" framing with the hybrid ownership pattern and a forward reference to FU-STEWARD-REQ-004. No changes to requirement IDs, data item IDs, field definitions, or the underlying field-level capability resolution. Carry-forward executed per crmbuilder/PRDs/process/interviews/guide-carry-forward-updates.md v1.1 two-gate pattern. Depends On line unchanged: Master PRD v2.5, Entity Inventory v1.5, Fundraising Domain Overview v1.0, FU-PROSPECT v1.0, Contact Entity PRD v1.6, Account Entity PRD v1.6.</w:t>
             </w:r>
           </w:p>
         </w:tc>

</xml_diff>